<commit_message>
Update RQ1/RQ2 and report section to the cleaned data (997 bookings)
Co-Authored-By: Claude Opus 5.5 <noreply@anthropic.com>
Claude-Session: https://claude.ai/code/session_01FuKupHrS6yidq12N9G7ME8
</commit_message>
<xml_diff>
--- a/report/Sandesh_RQ1_RQ2_report_section.docx
+++ b/report/Sandesh_RQ1_RQ2_report_section.docx
@@ -427,7 +427,7 @@
                 <w:sz w:val="20"/>
                 <w:szCs w:val="20"/>
               </w:rPr>
-              <w:t xml:space="preserve">363</w:t>
+              <w:t xml:space="preserve">360</w:t>
             </w:r>
           </w:p>
         </w:tc>
@@ -459,7 +459,7 @@
                 <w:sz w:val="20"/>
                 <w:szCs w:val="20"/>
               </w:rPr>
-              <w:t xml:space="preserve">642</w:t>
+              <w:t xml:space="preserve">639</w:t>
             </w:r>
           </w:p>
         </w:tc>
@@ -491,7 +491,7 @@
                 <w:sz w:val="20"/>
                 <w:szCs w:val="20"/>
               </w:rPr>
-              <w:t xml:space="preserve">43.5 %</w:t>
+              <w:t xml:space="preserve">43.7 %</w:t>
             </w:r>
           </w:p>
         </w:tc>
@@ -751,7 +751,7 @@
                 <w:sz w:val="20"/>
                 <w:szCs w:val="20"/>
               </w:rPr>
-              <w:t xml:space="preserve">634</w:t>
+              <w:t xml:space="preserve">631</w:t>
             </w:r>
           </w:p>
         </w:tc>
@@ -783,7 +783,7 @@
                 <w:sz w:val="20"/>
                 <w:szCs w:val="20"/>
               </w:rPr>
-              <w:t xml:space="preserve">1,000</w:t>
+              <w:t xml:space="preserve">997</w:t>
             </w:r>
           </w:p>
         </w:tc>
@@ -815,7 +815,7 @@
                 <w:sz w:val="20"/>
                 <w:szCs w:val="20"/>
               </w:rPr>
-              <w:t xml:space="preserve">36.6 %</w:t>
+              <w:t xml:space="preserve">36.7 %</w:t>
             </w:r>
           </w:p>
         </w:tc>
@@ -844,7 +844,7 @@
           <w:sz w:val="22"/>
           <w:szCs w:val="22"/>
         </w:rPr>
-        <w:t xml:space="preserve">City Hotel bookings were cancelled much more often than Resort Hotel bookings: 43.5 % against 24.3 %, a gap of about 19 percentage points. The deposit-type table showed one unusual result: all 116 Non Refund bookings were cancelled, while only 28.4 % of No Deposit bookings were. Guests rarely cancel bookings they cannot get refunded, so this may come from how the original data was recorded, and we do not build conclusions on it.</w:t>
+        <w:t xml:space="preserve">City Hotel bookings were cancelled much more often than Resort Hotel bookings: 43.7 % against 24.3 %, a gap of about 19 percentage points. The deposit-type table showed one unusual result: all 116 Non Refund bookings were cancelled, while only 28.5 % of No Deposit bookings were. Guests rarely cancel bookings they cannot get refunded, so this may come from how the original data was recorded, and we do not build conclusions on it.</w:t>
       </w:r>
     </w:p>
     <w:p>
@@ -855,7 +855,7 @@
       <w:r>
         <w:drawing>
           <wp:inline distT="0" distB="0" distL="0" distR="0">
-            <wp:extent cx="3429000" cy="2457450"/>
+            <wp:extent cx="3429000" cy="1938130"/>
             <wp:effectExtent t="0" r="0" b="0" l="0"/>
             <wp:docPr id="1" name="" descr="" title=""/>
             <wp:cNvGraphicFramePr>
@@ -880,7 +880,7 @@
                   <pic:spPr bwMode="auto">
                     <a:xfrm>
                       <a:off x="0" y="0"/>
-                      <a:ext cx="3429000" cy="2457450"/>
+                      <a:ext cx="3429000" cy="1938130"/>
                     </a:xfrm>
                     <a:prstGeom prst="rect">
                       <a:avLst/>
@@ -906,7 +906,7 @@
           <w:sz w:val="18"/>
           <w:szCs w:val="18"/>
         </w:rPr>
-        <w:t xml:space="preserve">Figure 1. Cancellation rate by hotel (n = 1,000 bookings).</w:t>
+        <w:t xml:space="preserve">Figure 1. Cancellation rate by hotel (n = 997 bookings).</w:t>
       </w:r>
     </w:p>
     <w:p>
@@ -1168,7 +1168,7 @@
                 <w:sz w:val="20"/>
                 <w:szCs w:val="20"/>
               </w:rPr>
-              <w:t xml:space="preserve">634</w:t>
+              <w:t xml:space="preserve">631</w:t>
             </w:r>
           </w:p>
         </w:tc>
@@ -1232,7 +1232,7 @@
                 <w:sz w:val="20"/>
                 <w:szCs w:val="20"/>
               </w:rPr>
-              <w:t xml:space="preserve">83.5</w:t>
+              <w:t xml:space="preserve">83.8</w:t>
             </w:r>
           </w:p>
         </w:tc>
@@ -1264,7 +1264,7 @@
                 <w:sz w:val="20"/>
                 <w:szCs w:val="20"/>
               </w:rPr>
-              <w:t xml:space="preserve">93.9</w:t>
+              <w:t xml:space="preserve">94.0</w:t>
             </w:r>
           </w:p>
         </w:tc>
@@ -1455,7 +1455,7 @@
           <w:sz w:val="22"/>
           <w:szCs w:val="22"/>
         </w:rPr>
-        <w:t xml:space="preserve">Cancelled bookings were made much further in advance. Their median lead time was 117 days, more than twice the 48 days of kept bookings. The cancellation rate rose in every lead-time band: 13.8 % for bookings made 0–7 days ahead, 26.5 % (8–30 days), 34.0 % (31–90), 42.7 % (91–180), 56.0 % (181–365) and 64.3 % for bookings made more than a year ahead. The last band has only 28 bookings, so its exact value is less reliable.</w:t>
+        <w:t xml:space="preserve">Cancelled bookings were made much further in advance. Their median lead time was 117 days, more than twice the 48 days of kept bookings. The cancellation rate rose in every lead-time band: 14.0 % for bookings made 0–7 days ahead, 26.5 % (8–30 days), 34.0 % (31–90), 42.7 % (91–180), 56.0 % (181–365) and 64.3 % for bookings made more than a year ahead. The last band has only 28 bookings, so its exact value is less reliable.</w:t>
       </w:r>
     </w:p>
     <w:p>
@@ -1466,7 +1466,7 @@
       <w:r>
         <w:drawing>
           <wp:inline distT="0" distB="0" distL="0" distR="0">
-            <wp:extent cx="3429000" cy="2124075"/>
+            <wp:extent cx="3429000" cy="2126848"/>
             <wp:effectExtent t="0" r="0" b="0" l="0"/>
             <wp:docPr id="1" name="" descr="" title=""/>
             <wp:cNvGraphicFramePr>
@@ -1491,7 +1491,7 @@
                   <pic:spPr bwMode="auto">
                     <a:xfrm>
                       <a:off x="0" y="0"/>
-                      <a:ext cx="3429000" cy="2124075"/>
+                      <a:ext cx="3429000" cy="2126848"/>
                     </a:xfrm>
                     <a:prstGeom prst="rect">
                       <a:avLst/>
@@ -1517,7 +1517,7 @@
           <w:sz w:val="18"/>
           <w:szCs w:val="18"/>
         </w:rPr>
-        <w:t xml:space="preserve">Figure 2. Lead time of kept and cancelled bookings (n = 1,000). The red line is the median.</w:t>
+        <w:t xml:space="preserve">Figure 2. Lead time of kept and cancelled bookings (n = 997). The red line is the median.</w:t>
       </w:r>
     </w:p>
     <w:p>
@@ -1583,7 +1583,7 @@
           <w:sz w:val="22"/>
           <w:szCs w:val="22"/>
         </w:rPr>
-        <w:t xml:space="preserve">The numbers in this section use all 1,000 bookings. They will change slightly after the cleaning step (3 bookings with no guests are removed), so the final values come from the finished notebook.</w:t>
+        <w:t xml:space="preserve">The numbers in this section use the cleaned data: 997 bookings, after the 3 bookings with no guests were removed in the cleaning step.</w:t>
       </w:r>
     </w:p>
     <w:sectPr>

</xml_diff>